<commit_message>
Plot refining for single algorithms
</commit_message>
<xml_diff>
--- a/Results/single_algorithm/SNF/TABLE Independent test between subtype and mutation.docx
+++ b/Results/single_algorithm/SNF/TABLE Independent test between subtype and mutation.docx
@@ -48,27 +48,27 @@
               <w:pStyle w:stlname="Normal" w:val="Normal"/>
             </w:pPr>
             <w:r>
-              <w:t>CS1</w:t>
-            </w:r>
-          </w:p>
-        </w:tc>
-        <w:tc>
-          <w:p>
-            <w:pPr>
-              <w:pStyle w:stlname="Normal" w:val="Normal"/>
-            </w:pPr>
-            <w:r>
-              <w:t>CS2</w:t>
-            </w:r>
-          </w:p>
-        </w:tc>
-        <w:tc>
-          <w:p>
-            <w:pPr>
-              <w:pStyle w:stlname="Normal" w:val="Normal"/>
-            </w:pPr>
-            <w:r>
-              <w:t>CS3</w:t>
+              <w:t>SNF1</w:t>
+            </w:r>
+          </w:p>
+        </w:tc>
+        <w:tc>
+          <w:p>
+            <w:pPr>
+              <w:pStyle w:stlname="Normal" w:val="Normal"/>
+            </w:pPr>
+            <w:r>
+              <w:t>SNF2</w:t>
+            </w:r>
+          </w:p>
+        </w:tc>
+        <w:tc>
+          <w:p>
+            <w:pPr>
+              <w:pStyle w:stlname="Normal" w:val="Normal"/>
+            </w:pPr>
+            <w:r>
+              <w:t>SNF3</w:t>
             </w:r>
           </w:p>
         </w:tc>

</xml_diff>